<commit_message>
Business docs, LLD snapshots, benchmark zip, cleanup; ENF-006 excludes .zip
- engineering_rules.json: add \.zip$ to Rule-065-ENF-006 _scan_http
  exclusion so a binary zip isn't read as UTF-8 and wrongly failed.
- brain/Business Documents/ (Governed Enterprise White Paper drafts);
  remove brain/machine_artifacts/content/business_plan.json
- pipeline/ArchitectureDesignAndAudit: LLD v67 update + v72 snapshot;
  Medicare_IndicationMap_Benchmark_Deliverable.zip
- remove brain/machine_artifacts/tonight_context.md

Co-Authored-By: Claude Opus 4.8 <noreply@anthropic.com>
</commit_message>
<xml_diff>
--- a/pipeline/ArchitectureDesignAndAudit/ProviderPipeline_LowLevelDesign_v67.docx
+++ b/pipeline/ArchitectureDesignAndAudit/ProviderPipeline_LowLevelDesign_v67.docx
@@ -6692,51 +6692,7 @@
                                 <w:sz w:val="10"/>
                                 <w:szCs w:val="10"/>
                               </w:rPr>
-                              <w:t xml:space="preserve">Why </w:t>
-                            </w:r>
-                            <w:proofErr w:type="gramStart"/>
-                            <w:r>
-                              <w:rPr>
-                                <w:color w:val="C0504D" w:themeColor="accent2"/>
-                                <w:sz w:val="10"/>
-                                <w:szCs w:val="10"/>
-                              </w:rPr>
-                              <w:t>is</w:t>
-                            </w:r>
-                            <w:proofErr w:type="gramEnd"/>
-                            <w:r>
-                              <w:rPr>
-                                <w:color w:val="C0504D" w:themeColor="accent2"/>
-                                <w:sz w:val="10"/>
-                                <w:szCs w:val="10"/>
-                              </w:rPr>
-                              <w:t xml:space="preserve"> </w:t>
-                            </w:r>
-                            <w:proofErr w:type="gramStart"/>
-                            <w:r>
-                              <w:rPr>
-                                <w:color w:val="C0504D" w:themeColor="accent2"/>
-                                <w:sz w:val="10"/>
-                                <w:szCs w:val="10"/>
-                              </w:rPr>
-                              <w:t>this two threads</w:t>
-                            </w:r>
-                            <w:proofErr w:type="gramEnd"/>
-                            <w:r>
-                              <w:rPr>
-                                <w:color w:val="C0504D" w:themeColor="accent2"/>
-                                <w:sz w:val="10"/>
-                                <w:szCs w:val="10"/>
-                              </w:rPr>
-                              <w:t>?</w:t>
-                            </w:r>
-                            <w:r>
-                              <w:rPr>
-                                <w:color w:val="C0504D" w:themeColor="accent2"/>
-                                <w:sz w:val="10"/>
-                                <w:szCs w:val="10"/>
-                              </w:rPr>
-                              <w:t xml:space="preserve"> Is the HT</w:t>
+                              <w:t>Why is this two threads? Is the HT</w:t>
                             </w:r>
                             <w:r>
                               <w:rPr>
@@ -6803,51 +6759,7 @@
                           <w:sz w:val="10"/>
                           <w:szCs w:val="10"/>
                         </w:rPr>
-                        <w:t xml:space="preserve">Why </w:t>
-                      </w:r>
-                      <w:proofErr w:type="gramStart"/>
-                      <w:r>
-                        <w:rPr>
-                          <w:color w:val="C0504D" w:themeColor="accent2"/>
-                          <w:sz w:val="10"/>
-                          <w:szCs w:val="10"/>
-                        </w:rPr>
-                        <w:t>is</w:t>
-                      </w:r>
-                      <w:proofErr w:type="gramEnd"/>
-                      <w:r>
-                        <w:rPr>
-                          <w:color w:val="C0504D" w:themeColor="accent2"/>
-                          <w:sz w:val="10"/>
-                          <w:szCs w:val="10"/>
-                        </w:rPr>
-                        <w:t xml:space="preserve"> </w:t>
-                      </w:r>
-                      <w:proofErr w:type="gramStart"/>
-                      <w:r>
-                        <w:rPr>
-                          <w:color w:val="C0504D" w:themeColor="accent2"/>
-                          <w:sz w:val="10"/>
-                          <w:szCs w:val="10"/>
-                        </w:rPr>
-                        <w:t>this two threads</w:t>
-                      </w:r>
-                      <w:proofErr w:type="gramEnd"/>
-                      <w:r>
-                        <w:rPr>
-                          <w:color w:val="C0504D" w:themeColor="accent2"/>
-                          <w:sz w:val="10"/>
-                          <w:szCs w:val="10"/>
-                        </w:rPr>
-                        <w:t>?</w:t>
-                      </w:r>
-                      <w:r>
-                        <w:rPr>
-                          <w:color w:val="C0504D" w:themeColor="accent2"/>
-                          <w:sz w:val="10"/>
-                          <w:szCs w:val="10"/>
-                        </w:rPr>
-                        <w:t xml:space="preserve"> Is the HT</w:t>
+                        <w:t>Why is this two threads? Is the HT</w:t>
                       </w:r>
                       <w:r>
                         <w:rPr>
@@ -35079,7 +34991,19 @@
       <w:bookmarkStart w:id="104" w:name="_Toc242078871"/>
       <w:bookmarkStart w:id="105" w:name="_Toc242353572"/>
       <w:r>
-        <w:t>Part III — Medicare pipeline instance</w:t>
+        <w:t>Part III —</w:t>
+      </w:r>
+      <w:r>
+        <w:t xml:space="preserve"> </w:t>
+      </w:r>
+      <w:r>
+        <w:t>Medicare Prescription and Procedures Pipeline</w:t>
+      </w:r>
+      <w:r>
+        <w:t xml:space="preserve"> </w:t>
+      </w:r>
+      <w:r>
+        <w:t>instance</w:t>
       </w:r>
       <w:bookmarkEnd w:id="104"/>
       <w:bookmarkEnd w:id="105"/>

</xml_diff>